<commit_message>
Release Notes v1.4.0: add Edit > Delete Frame
Co-Authored-By: Claude Sonnet 5.5 <noreply@anthropic.com>
</commit_message>
<xml_diff>
--- a/doc/mlw-xsheet-v1.4.0-Release-Notes.docx
+++ b/doc/mlw-xsheet-v1.4.0-Release-Notes.docx
@@ -1276,7 +1276,7 @@
       </w:pPr>
       <w:r>
         <w:rPr/>
-        <w:t>Version 1.4.0 builds on the Sketchpad and the tabs. The Sketchpad can now place text strings, in a typeface and size chosen in a new Preferences &gt; Sketchpad tab, and Export XSheet prints them. Undo and Redo are now global: one history across the XSheet, XML and SVG tabs that takes back whatever was changed last, with a warning when that was on a tab other than the one showing. The XML tab can be hidden (XML &gt; XML Editor), and the SVG tab now shows only while the Sketchpad is on, between XSheet and XML, with Ctrl+Alt+1, 2 and 3 following the tabs that are showing. On the XSheet tab, Ctrl+Alt+Page Up and Page Down step by frame group, Edit &gt; Find opens a Find Frame dialog that goes to a frame number, and Find &amp; Replace now works on the SVG tab too. Section 2, Update, lists everything that is different from version 1.3.0.</w:t>
+        <w:t>Version 1.4.0 builds on the Sketchpad and the tabs. The Sketchpad can now place text strings, in a typeface and size chosen in a new Preferences &gt; Sketchpad tab, and Export XSheet prints them. Undo and Redo are now global: one history across the XSheet, XML and SVG tabs that takes back whatever was changed last, with a warning when that was on a tab other than the one showing. The XML tab can be hidden (XML &gt; XML Editor), and the SVG tab now shows only while the Sketchpad is on, between XSheet and XML, with Ctrl+Alt+1, 2 and 3 following the tabs that are showing. On the XSheet tab, Ctrl+Alt+Page Up and Page Down step by frame group, Edit &gt; Find opens a Find Frame dialog that goes to a frame number, and Find &amp; Replace now works on the SVG tab too. Edit &gt; Delete Frame deletes frames from the sheet, rows and all, closing the gap. Section 2, Update, lists everything that is different from version 1.3.0.</w:t>
       </w:r>
     </w:p>
     <w:p>
@@ -1399,6 +1399,28 @@
       <w:r>
         <w:rPr/>
         <w:t>: the same dialog, working on the SVG editor, so a replacement changes the sketch. Preferences has a new Sketchpad tab and now opens on XSheet, then Sketchpad, then the rest.</w:t>
+      </w:r>
+    </w:p>
+    <w:p>
+      <w:pPr>
+        <w:pStyle w:val="ListBullet"/>
+        <w:numPr>
+          <w:ilvl w:val="0"/>
+          <w:numId w:val="1"/>
+        </w:numPr>
+        <w:spacing w:before="0" w:after="60"/>
+        <w:contextualSpacing/>
+        <w:rPr/>
+      </w:pPr>
+      <w:r>
+        <w:rPr>
+          <w:b/>
+        </w:rPr>
+        <w:t>Delete Frame</w:t>
+      </w:r>
+      <w:r>
+        <w:rPr/>
+        <w:t>: Edit &gt; Delete Frame (XSheet tab only) asks for a starting frame and a count, then deletes those frames — their rows go, not just their drawings — and moves the later frames up, with their camera moves, audio cues and reviews. It is one undoable edit, and the document stays schema-valid.</w:t>
       </w:r>
     </w:p>
     <w:p>
@@ -1607,7 +1629,7 @@
       </w:pPr>
       <w:r>
         <w:rPr/>
-        <w:t>Version 1.4.0 is a feature release. It keeps the document format and the schemas of 1.3.0, so documents, their sketches, settings, drafts and the pop-up log carry over unchanged. It adds text to the Sketchpad and a Sketchpad tab to Preferences, makes Undo and Redo global across the tabs, lets the XML tab be hidden and shows the SVG tab only while the Sketchpad is on, adds frame-group navigation and a Find Frame dialog to the XSheet tab, and lets Find &amp; Replace work on the SVG tab.</w:t>
+        <w:t>Version 1.4.0 is a feature release. It keeps the document format and the schemas of 1.3.0, so documents, their sketches, settings, drafts and the pop-up log carry over unchanged. It adds text to the Sketchpad and a Sketchpad tab to Preferences, makes Undo and Redo global across the tabs, lets the XML tab be hidden and shows the SVG tab only while the Sketchpad is on, adds frame-group navigation and a Find Frame dialog to the XSheet tab, adds Delete Frame to the Edit menu, and lets Find &amp; Replace work on the SVG tab.</w:t>
       </w:r>
     </w:p>
     <w:p>
@@ -2454,6 +2476,72 @@
                 <w:lang w:val="en-US" w:eastAsia="en-US" w:bidi="ar-SA"/>
               </w:rPr>
               <w:t>The Find &amp; Replace dialog works on the SVG editor when the SVG tab is showing.</w:t>
+            </w:r>
+          </w:p>
+        </w:tc>
+      </w:tr>
+      <w:tr>
+        <w:trPr>
+          <w:cantSplit w:val="true"/>
+        </w:trPr>
+        <w:tc>
+          <w:tcPr>
+            <w:tcW w:w="2880" w:type="dxa"/>
+            <w:tcBorders/>
+          </w:tcPr>
+          <w:p>
+            <w:pPr>
+              <w:pStyle w:val="Normal"/>
+              <w:widowControl/>
+              <w:spacing w:before="0" w:after="0"/>
+              <w:jc w:val="left"/>
+              <w:rPr>
+                <w:rFonts w:cs=""/>
+                <w:kern w:val="0"/>
+                <w:szCs w:val="22"/>
+                <w:lang w:val="en-US" w:eastAsia="en-US" w:bidi="ar-SA"/>
+              </w:rPr>
+            </w:pPr>
+            <w:r>
+              <w:rPr>
+                <w:rFonts w:cs=""/>
+                <w:b/>
+                <w:kern w:val="0"/>
+                <w:sz w:val="19"/>
+                <w:szCs w:val="22"/>
+                <w:lang w:val="en-US" w:eastAsia="en-US" w:bidi="ar-SA"/>
+              </w:rPr>
+              <w:t>Edit &gt; Delete Frame</w:t>
+            </w:r>
+          </w:p>
+        </w:tc>
+        <w:tc>
+          <w:tcPr>
+            <w:tcW w:w="6479" w:type="dxa"/>
+            <w:tcBorders/>
+          </w:tcPr>
+          <w:p>
+            <w:pPr>
+              <w:pStyle w:val="Normal"/>
+              <w:widowControl/>
+              <w:spacing w:before="0" w:after="0"/>
+              <w:jc w:val="left"/>
+              <w:rPr>
+                <w:rFonts w:cs=""/>
+                <w:kern w:val="0"/>
+                <w:szCs w:val="22"/>
+                <w:lang w:val="en-US" w:eastAsia="en-US" w:bidi="ar-SA"/>
+              </w:rPr>
+            </w:pPr>
+            <w:r>
+              <w:rPr>
+                <w:rFonts w:cs=""/>
+                <w:kern w:val="0"/>
+                <w:sz w:val="19"/>
+                <w:szCs w:val="22"/>
+                <w:lang w:val="en-US" w:eastAsia="en-US" w:bidi="ar-SA"/>
+              </w:rPr>
+              <w:t>Below Add Frame, available on the XSheet tab only. A dialog asks for the starting frame (the selected one) and how many frames to delete; the rows are removed and the later frames move up.</w:t>
             </w:r>
           </w:p>
         </w:tc>
@@ -3093,6 +3181,102 @@
                 <w:lang w:val="en-US" w:eastAsia="en-US" w:bidi="ar-SA"/>
               </w:rPr>
               <w:t>Starts with an XML Editor check box, always enabled; the other commands are enabled on the XML tab.</w:t>
+            </w:r>
+          </w:p>
+        </w:tc>
+      </w:tr>
+      <w:tr>
+        <w:trPr>
+          <w:cantSplit w:val="true"/>
+        </w:trPr>
+        <w:tc>
+          <w:tcPr>
+            <w:tcW w:w="1944" w:type="dxa"/>
+            <w:tcBorders/>
+          </w:tcPr>
+          <w:p>
+            <w:pPr>
+              <w:pStyle w:val="Normal"/>
+              <w:widowControl/>
+              <w:spacing w:before="0" w:after="0"/>
+              <w:jc w:val="left"/>
+              <w:rPr>
+                <w:rFonts w:cs=""/>
+                <w:kern w:val="0"/>
+                <w:szCs w:val="22"/>
+                <w:lang w:val="en-US" w:eastAsia="en-US" w:bidi="ar-SA"/>
+              </w:rPr>
+            </w:pPr>
+            <w:r>
+              <w:rPr>
+                <w:rFonts w:cs=""/>
+                <w:b/>
+                <w:kern w:val="0"/>
+                <w:sz w:val="19"/>
+                <w:szCs w:val="22"/>
+                <w:lang w:val="en-US" w:eastAsia="en-US" w:bidi="ar-SA"/>
+              </w:rPr>
+              <w:t>Edit menu</w:t>
+            </w:r>
+          </w:p>
+        </w:tc>
+        <w:tc>
+          <w:tcPr>
+            <w:tcW w:w="3168" w:type="dxa"/>
+            <w:tcBorders/>
+          </w:tcPr>
+          <w:p>
+            <w:pPr>
+              <w:pStyle w:val="Normal"/>
+              <w:widowControl/>
+              <w:spacing w:before="0" w:after="0"/>
+              <w:jc w:val="left"/>
+              <w:rPr>
+                <w:rFonts w:cs=""/>
+                <w:kern w:val="0"/>
+                <w:szCs w:val="22"/>
+                <w:lang w:val="en-US" w:eastAsia="en-US" w:bidi="ar-SA"/>
+              </w:rPr>
+            </w:pPr>
+            <w:r>
+              <w:rPr>
+                <w:rFonts w:cs=""/>
+                <w:kern w:val="0"/>
+                <w:sz w:val="19"/>
+                <w:szCs w:val="22"/>
+                <w:lang w:val="en-US" w:eastAsia="en-US" w:bidi="ar-SA"/>
+              </w:rPr>
+              <w:t>Add Frame, Add Layer, Find, Undo, Redo.</w:t>
+            </w:r>
+          </w:p>
+        </w:tc>
+        <w:tc>
+          <w:tcPr>
+            <w:tcW w:w="4248" w:type="dxa"/>
+            <w:tcBorders/>
+          </w:tcPr>
+          <w:p>
+            <w:pPr>
+              <w:pStyle w:val="Normal"/>
+              <w:widowControl/>
+              <w:spacing w:before="0" w:after="0"/>
+              <w:jc w:val="left"/>
+              <w:rPr>
+                <w:rFonts w:cs=""/>
+                <w:kern w:val="0"/>
+                <w:szCs w:val="22"/>
+                <w:lang w:val="en-US" w:eastAsia="en-US" w:bidi="ar-SA"/>
+              </w:rPr>
+            </w:pPr>
+            <w:r>
+              <w:rPr>
+                <w:rFonts w:cs=""/>
+                <w:kern w:val="0"/>
+                <w:sz w:val="19"/>
+                <w:szCs w:val="22"/>
+                <w:lang w:val="en-US" w:eastAsia="en-US" w:bidi="ar-SA"/>
+              </w:rPr>
+              <w:t>Also Delete Frame, below Add Frame, enabled on the XSheet tab only.</w:t>
             </w:r>
           </w:p>
         </w:tc>
@@ -4078,6 +4262,98 @@
                 <w:szCs w:val="22"/>
                 <w:lang w:val="en-US" w:eastAsia="en-US" w:bidi="ar-SA"/>
               </w:rPr>
+              <w:t>Delete Frame</w:t>
+            </w:r>
+          </w:p>
+          <w:p>
+            <w:pPr>
+              <w:pStyle w:val="Normal"/>
+              <w:widowControl/>
+              <w:spacing w:before="0" w:after="0"/>
+              <w:jc w:val="left"/>
+              <w:rPr>
+                <w:rFonts w:cs=""/>
+                <w:kern w:val="0"/>
+                <w:szCs w:val="22"/>
+                <w:lang w:val="en-US" w:eastAsia="en-US" w:bidi="ar-SA"/>
+              </w:rPr>
+            </w:pPr>
+            <w:r>
+              <w:rPr>
+                <w:rFonts w:cs=""/>
+                <w:b/>
+                <w:color w:val="B25E00"/>
+                <w:kern w:val="0"/>
+                <w:sz w:val="16"/>
+                <w:szCs w:val="22"/>
+                <w:lang w:val="en-US" w:eastAsia="en-US" w:bidi="ar-SA"/>
+              </w:rPr>
+              <w:t>New in 1.4.0</w:t>
+            </w:r>
+          </w:p>
+        </w:tc>
+        <w:tc>
+          <w:tcPr>
+            <w:tcW w:w="7055" w:type="dxa"/>
+            <w:tcBorders/>
+          </w:tcPr>
+          <w:p>
+            <w:pPr>
+              <w:pStyle w:val="Normal"/>
+              <w:widowControl/>
+              <w:spacing w:before="0" w:after="0"/>
+              <w:jc w:val="left"/>
+              <w:rPr>
+                <w:rFonts w:cs=""/>
+                <w:kern w:val="0"/>
+                <w:szCs w:val="22"/>
+                <w:lang w:val="en-US" w:eastAsia="en-US" w:bidi="ar-SA"/>
+              </w:rPr>
+            </w:pPr>
+            <w:r>
+              <w:rPr>
+                <w:rFonts w:cs=""/>
+                <w:kern w:val="0"/>
+                <w:sz w:val="19"/>
+                <w:szCs w:val="22"/>
+                <w:lang w:val="en-US" w:eastAsia="en-US" w:bidi="ar-SA"/>
+              </w:rPr>
+              <w:t>Edit &gt; Delete Frame, below Add Frame and enabled on the XSheet tab only, asks for the Starting frame (the selected frame to begin with) and the Number of frames to delete, then deletes them: the rows go, they are not just cleared, and the later frames move up to close the gap. Frame numbers, EndFrame, “Frame N” comment banners and the frames of camera moves, audio cues, keyframes and reviews all move up with them. A move or cue that spanned deleted frames is cut short (one wholly inside them shrinks to a single frame), and a keyframe or review on a deleted frame moves to the frame that takes its place. Later frames that were holding a drawing set in the deleted ones still hold it, so they look the same. A sheet cannot lose every frame, or more than it has from the starting frame. It is one undoable edit that keeps the document schema-valid.</w:t>
+            </w:r>
+          </w:p>
+        </w:tc>
+      </w:tr>
+      <w:tr>
+        <w:trPr>
+          <w:cantSplit w:val="true"/>
+        </w:trPr>
+        <w:tc>
+          <w:tcPr>
+            <w:tcW w:w="2304" w:type="dxa"/>
+            <w:tcBorders/>
+          </w:tcPr>
+          <w:p>
+            <w:pPr>
+              <w:pStyle w:val="Normal"/>
+              <w:widowControl/>
+              <w:spacing w:before="0" w:after="0"/>
+              <w:jc w:val="left"/>
+              <w:rPr>
+                <w:rFonts w:cs=""/>
+                <w:kern w:val="0"/>
+                <w:szCs w:val="22"/>
+                <w:lang w:val="en-US" w:eastAsia="en-US" w:bidi="ar-SA"/>
+              </w:rPr>
+            </w:pPr>
+            <w:r>
+              <w:rPr>
+                <w:rFonts w:cs=""/>
+                <w:b/>
+                <w:kern w:val="0"/>
+                <w:sz w:val="19"/>
+                <w:szCs w:val="22"/>
+                <w:lang w:val="en-US" w:eastAsia="en-US" w:bidi="ar-SA"/>
+              </w:rPr>
               <w:t>Add Layer</w:t>
             </w:r>
           </w:p>
@@ -10238,7 +10514,7 @@
                 <w:szCs w:val="22"/>
                 <w:lang w:val="en-US" w:eastAsia="en-US" w:bidi="ar-SA"/>
               </w:rPr>
-              <w:t>File: New, Open, Open Recent, Save, Save As, Close, Export (Export XDTS, Export OCA), Preferences. Edit: Add Frame, Add Layer, Find (Find Frame on the XSheet tab), Undo, Redo. XSheet: Sketchpad, Collapse Frames, Expand Frames, Export XSheet, Generate Report. XML: XML Editor (a check box), Validate (well-formed), Validate against Schema, Clear Validation, Select Schema, Clear Schema, Format. About: About, Reviews. Export opens its submenu like Open Recent.</w:t>
+              <w:t>File: New, Open, Open Recent, Save, Save As, Close, Export (Export XDTS, Export OCA), Preferences. Edit: Add Frame, Delete Frame (XSheet tab only), Add Layer, Find (Find Frame on the XSheet tab), Undo, Redo. XSheet: Sketchpad, Collapse Frames, Expand Frames, Export XSheet, Generate Report. XML: XML Editor (a check box), Validate (well-formed), Validate against Schema, Clear Validation, Select Schema, Clear Schema, Format. About: About, Reviews. Export opens its submenu like Open Recent.</w:t>
             </w:r>
           </w:p>
         </w:tc>
@@ -13648,7 +13924,7 @@
       </w:pPr>
       <w:r>
         <w:rPr/>
-        <w:t>These were found during development and have not been filed as GitHub issues. The last three are new in this release.</w:t>
+        <w:t>These were found during development and have not been filed as GitHub issues. The last four are new in this release.</w:t>
       </w:r>
     </w:p>
     <w:tbl>
@@ -15543,6 +15819,72 @@
                 <w:lang w:val="en-US" w:eastAsia="en-US" w:bidi="ar-SA"/>
               </w:rPr>
               <w:t>While a string is being typed, scrolling the grid leaves the typing box where it was. Finish the string first.</w:t>
+            </w:r>
+          </w:p>
+        </w:tc>
+      </w:tr>
+      <w:tr>
+        <w:trPr>
+          <w:cantSplit w:val="true"/>
+        </w:trPr>
+        <w:tc>
+          <w:tcPr>
+            <w:tcW w:w="2304" w:type="dxa"/>
+            <w:tcBorders/>
+          </w:tcPr>
+          <w:p>
+            <w:pPr>
+              <w:pStyle w:val="Normal"/>
+              <w:widowControl/>
+              <w:spacing w:before="0" w:after="0"/>
+              <w:jc w:val="left"/>
+              <w:rPr>
+                <w:rFonts w:cs=""/>
+                <w:kern w:val="0"/>
+                <w:szCs w:val="22"/>
+                <w:lang w:val="en-US" w:eastAsia="en-US" w:bidi="ar-SA"/>
+              </w:rPr>
+            </w:pPr>
+            <w:r>
+              <w:rPr>
+                <w:rFonts w:cs=""/>
+                <w:b/>
+                <w:kern w:val="0"/>
+                <w:sz w:val="19"/>
+                <w:szCs w:val="22"/>
+                <w:lang w:val="en-US" w:eastAsia="en-US" w:bidi="ar-SA"/>
+              </w:rPr>
+              <w:t>Delete Frame cuts moves short</w:t>
+            </w:r>
+          </w:p>
+        </w:tc>
+        <w:tc>
+          <w:tcPr>
+            <w:tcW w:w="7055" w:type="dxa"/>
+            <w:tcBorders/>
+          </w:tcPr>
+          <w:p>
+            <w:pPr>
+              <w:pStyle w:val="Normal"/>
+              <w:widowControl/>
+              <w:spacing w:before="0" w:after="0"/>
+              <w:jc w:val="left"/>
+              <w:rPr>
+                <w:rFonts w:cs=""/>
+                <w:kern w:val="0"/>
+                <w:szCs w:val="22"/>
+                <w:lang w:val="en-US" w:eastAsia="en-US" w:bidi="ar-SA"/>
+              </w:rPr>
+            </w:pPr>
+            <w:r>
+              <w:rPr>
+                <w:rFonts w:cs=""/>
+                <w:kern w:val="0"/>
+                <w:sz w:val="19"/>
+                <w:szCs w:val="22"/>
+                <w:lang w:val="en-US" w:eastAsia="en-US" w:bidi="ar-SA"/>
+              </w:rPr>
+              <w:t>Deleting frames cuts a camera move or audio cue that spanned them short, and shrinks one wholly inside them to a single frame; a keyframe or review on a deleted frame moves to the frame that takes its place. None is removed, so check the camera moves and cues after a large deletion.</w:t>
             </w:r>
           </w:p>
         </w:tc>

</xml_diff>

<commit_message>
Release Notes v1.4.0: add Edit > Delete Layer
Co-Authored-By: Claude Sonnet 5.5 <noreply@anthropic.com>
</commit_message>
<xml_diff>
--- a/doc/mlw-xsheet-v1.4.0-Release-Notes.docx
+++ b/doc/mlw-xsheet-v1.4.0-Release-Notes.docx
@@ -1276,7 +1276,7 @@
       </w:pPr>
       <w:r>
         <w:rPr/>
-        <w:t>Version 1.4.0 builds on the Sketchpad and the tabs. The Sketchpad can now place text strings, in a typeface and size chosen in a new Preferences &gt; Sketchpad tab, and Export XSheet prints them. Undo and Redo are now global: one history across the XSheet, XML and SVG tabs that takes back whatever was changed last, with a warning when that was on a tab other than the one showing. The XML tab can be hidden (XML &gt; XML Editor), and the SVG tab now shows only while the Sketchpad is on, between XSheet and XML, with Ctrl+Alt+1, 2 and 3 following the tabs that are showing. On the XSheet tab, Ctrl+Alt+Page Up and Page Down step by frame group, Edit &gt; Find opens a Find Frame dialog that goes to a frame number, and Find &amp; Replace now works on the SVG tab too. Edit &gt; Delete Frame deletes frames from the sheet, rows and all, closing the gap. Section 2, Update, lists everything that is different from version 1.3.0.</w:t>
+        <w:t>Version 1.4.0 builds on the Sketchpad and the tabs. The Sketchpad can now place text strings, in a typeface and size chosen in a new Preferences &gt; Sketchpad tab, and Export XSheet prints them. Undo and Redo are now global: one history across the XSheet, XML and SVG tabs that takes back whatever was changed last, with a warning when that was on a tab other than the one showing. The XML tab can be hidden (XML &gt; XML Editor), and the SVG tab now shows only while the Sketchpad is on, between XSheet and XML, with Ctrl+Alt+1, 2 and 3 following the tabs that are showing. On the XSheet tab, Ctrl+Alt+Page Up and Page Down step by frame group, Edit &gt; Find opens a Find Frame dialog that goes to a frame number, and Find &amp; Replace now works on the SVG tab too. Edit &gt; Delete Frame deletes frames from the sheet, rows and all, closing the gap, and Edit &gt; Delete Layer deletes a whole column. Section 2, Update, lists everything that is different from version 1.3.0.</w:t>
       </w:r>
     </w:p>
     <w:p>
@@ -1421,6 +1421,28 @@
       <w:r>
         <w:rPr/>
         <w:t>: Edit &gt; Delete Frame (XSheet tab only) asks for a starting frame and a count, then deletes those frames — their rows go, not just their drawings — and moves the later frames up, with their camera moves, audio cues and reviews. It is one undoable edit, and the document stays schema-valid.</w:t>
+      </w:r>
+    </w:p>
+    <w:p>
+      <w:pPr>
+        <w:pStyle w:val="ListBullet"/>
+        <w:numPr>
+          <w:ilvl w:val="0"/>
+          <w:numId w:val="1"/>
+        </w:numPr>
+        <w:spacing w:before="0" w:after="60"/>
+        <w:contextualSpacing/>
+        <w:rPr/>
+      </w:pPr>
+      <w:r>
+        <w:rPr>
+          <w:b/>
+        </w:rPr>
+        <w:t>Delete Layer</w:t>
+      </w:r>
+      <w:r>
+        <w:rPr/>
+        <w:t>: Edit &gt; Delete Layer (XSheet tab only) deletes the column you last clicked, or any other you choose: a layer is removed from every frame, and the other columns (notes, dialogue, audio, sound effects, camera moves, technical notes) delete their data.</w:t>
       </w:r>
     </w:p>
     <w:p>
@@ -1629,7 +1651,7 @@
       </w:pPr>
       <w:r>
         <w:rPr/>
-        <w:t>Version 1.4.0 is a feature release. It keeps the document format and the schemas of 1.3.0, so documents, their sketches, settings, drafts and the pop-up log carry over unchanged. It adds text to the Sketchpad and a Sketchpad tab to Preferences, makes Undo and Redo global across the tabs, lets the XML tab be hidden and shows the SVG tab only while the Sketchpad is on, adds frame-group navigation and a Find Frame dialog to the XSheet tab, adds Delete Frame to the Edit menu, and lets Find &amp; Replace work on the SVG tab.</w:t>
+        <w:t>Version 1.4.0 is a feature release. It keeps the document format and the schemas of 1.3.0, so documents, their sketches, settings, drafts and the pop-up log carry over unchanged. It adds text to the Sketchpad and a Sketchpad tab to Preferences, makes Undo and Redo global across the tabs, lets the XML tab be hidden and shows the SVG tab only while the Sketchpad is on, adds frame-group navigation and a Find Frame dialog to the XSheet tab, adds Delete Frame and Delete Layer to the Edit menu, and lets Find &amp; Replace work on the SVG tab.</w:t>
       </w:r>
     </w:p>
     <w:p>
@@ -2542,6 +2564,72 @@
                 <w:lang w:val="en-US" w:eastAsia="en-US" w:bidi="ar-SA"/>
               </w:rPr>
               <w:t>Below Add Frame, available on the XSheet tab only. A dialog asks for the starting frame (the selected one) and how many frames to delete; the rows are removed and the later frames move up.</w:t>
+            </w:r>
+          </w:p>
+        </w:tc>
+      </w:tr>
+      <w:tr>
+        <w:trPr>
+          <w:cantSplit w:val="true"/>
+        </w:trPr>
+        <w:tc>
+          <w:tcPr>
+            <w:tcW w:w="2880" w:type="dxa"/>
+            <w:tcBorders/>
+          </w:tcPr>
+          <w:p>
+            <w:pPr>
+              <w:pStyle w:val="Normal"/>
+              <w:widowControl/>
+              <w:spacing w:before="0" w:after="0"/>
+              <w:jc w:val="left"/>
+              <w:rPr>
+                <w:rFonts w:cs=""/>
+                <w:kern w:val="0"/>
+                <w:szCs w:val="22"/>
+                <w:lang w:val="en-US" w:eastAsia="en-US" w:bidi="ar-SA"/>
+              </w:rPr>
+            </w:pPr>
+            <w:r>
+              <w:rPr>
+                <w:rFonts w:cs=""/>
+                <w:b/>
+                <w:kern w:val="0"/>
+                <w:sz w:val="19"/>
+                <w:szCs w:val="22"/>
+                <w:lang w:val="en-US" w:eastAsia="en-US" w:bidi="ar-SA"/>
+              </w:rPr>
+              <w:t>Edit &gt; Delete Layer</w:t>
+            </w:r>
+          </w:p>
+        </w:tc>
+        <w:tc>
+          <w:tcPr>
+            <w:tcW w:w="6479" w:type="dxa"/>
+            <w:tcBorders/>
+          </w:tcPr>
+          <w:p>
+            <w:pPr>
+              <w:pStyle w:val="Normal"/>
+              <w:widowControl/>
+              <w:spacing w:before="0" w:after="0"/>
+              <w:jc w:val="left"/>
+              <w:rPr>
+                <w:rFonts w:cs=""/>
+                <w:kern w:val="0"/>
+                <w:szCs w:val="22"/>
+                <w:lang w:val="en-US" w:eastAsia="en-US" w:bidi="ar-SA"/>
+              </w:rPr>
+            </w:pPr>
+            <w:r>
+              <w:rPr>
+                <w:rFonts w:cs=""/>
+                <w:kern w:val="0"/>
+                <w:sz w:val="19"/>
+                <w:szCs w:val="22"/>
+                <w:lang w:val="en-US" w:eastAsia="en-US" w:bidi="ar-SA"/>
+              </w:rPr>
+              <w:t>Below Add Layer, available on the XSheet tab only. Deletes a whole XSheet column from the document: a layer from every frame, or the data of the Notes, Dialogue, Audio, Sound FX, Camera Moves or Tech. Notes column.</w:t>
             </w:r>
           </w:p>
         </w:tc>
@@ -3276,7 +3364,7 @@
                 <w:szCs w:val="22"/>
                 <w:lang w:val="en-US" w:eastAsia="en-US" w:bidi="ar-SA"/>
               </w:rPr>
-              <w:t>Also Delete Frame, below Add Frame, enabled on the XSheet tab only.</w:t>
+              <w:t>Also Delete Frame, below Add Frame, and Delete Layer, below Add Layer; both are enabled on the XSheet tab only.</w:t>
             </w:r>
           </w:p>
         </w:tc>
@@ -4501,6 +4589,98 @@
                 <w:szCs w:val="22"/>
                 <w:lang w:val="en-US" w:eastAsia="en-US" w:bidi="ar-SA"/>
               </w:rPr>
+              <w:t>Delete Layer</w:t>
+            </w:r>
+          </w:p>
+          <w:p>
+            <w:pPr>
+              <w:pStyle w:val="Normal"/>
+              <w:widowControl/>
+              <w:spacing w:before="0" w:after="0"/>
+              <w:jc w:val="left"/>
+              <w:rPr>
+                <w:rFonts w:cs=""/>
+                <w:kern w:val="0"/>
+                <w:szCs w:val="22"/>
+                <w:lang w:val="en-US" w:eastAsia="en-US" w:bidi="ar-SA"/>
+              </w:rPr>
+            </w:pPr>
+            <w:r>
+              <w:rPr>
+                <w:rFonts w:cs=""/>
+                <w:b/>
+                <w:color w:val="B25E00"/>
+                <w:kern w:val="0"/>
+                <w:sz w:val="16"/>
+                <w:szCs w:val="22"/>
+                <w:lang w:val="en-US" w:eastAsia="en-US" w:bidi="ar-SA"/>
+              </w:rPr>
+              <w:t>New in 1.4.0</w:t>
+            </w:r>
+          </w:p>
+        </w:tc>
+        <w:tc>
+          <w:tcPr>
+            <w:tcW w:w="7055" w:type="dxa"/>
+            <w:tcBorders/>
+          </w:tcPr>
+          <w:p>
+            <w:pPr>
+              <w:pStyle w:val="Normal"/>
+              <w:widowControl/>
+              <w:spacing w:before="0" w:after="0"/>
+              <w:jc w:val="left"/>
+              <w:rPr>
+                <w:rFonts w:cs=""/>
+                <w:kern w:val="0"/>
+                <w:szCs w:val="22"/>
+                <w:lang w:val="en-US" w:eastAsia="en-US" w:bidi="ar-SA"/>
+              </w:rPr>
+            </w:pPr>
+            <w:r>
+              <w:rPr>
+                <w:rFonts w:cs=""/>
+                <w:kern w:val="0"/>
+                <w:sz w:val="19"/>
+                <w:szCs w:val="22"/>
+                <w:lang w:val="en-US" w:eastAsia="en-US" w:bidi="ar-SA"/>
+              </w:rPr>
+              <w:t>Edit &gt; Delete Layer, below Add Layer and enabled on the XSheet tab only, deletes a whole column of the sheet from the document. Its dialog offers the column whose cell you last clicked, and a list to choose another; a line says what deleting it does. A layer column removes that layer from every frame, and its OTIO track map; a frame left with no layer holds another layer’s drawing, as the schema needs one, and the last layer cannot be deleted. The other columns delete their data in every frame: Notes (Action/Description) clears the notes, leaving the empty &lt;Notes/&gt; the schema requires; Dialogue removes the dialogue; Audio and Sound FX remove the audio cues (the traditional sheet’s Audio column those of the tracks that are not sound effects, the Classic sheet’s every cue); Camera Moves removes the camera moves, and the camera keyframes stay; Tech. Notes clears the camera keyframes’ notes, as review comments are edited in About &gt; Reviews. The Frame columns cannot be deleted. It is one undoable edit that keeps the document schema-valid.</w:t>
+            </w:r>
+          </w:p>
+        </w:tc>
+      </w:tr>
+      <w:tr>
+        <w:trPr>
+          <w:cantSplit w:val="true"/>
+        </w:trPr>
+        <w:tc>
+          <w:tcPr>
+            <w:tcW w:w="2304" w:type="dxa"/>
+            <w:tcBorders/>
+          </w:tcPr>
+          <w:p>
+            <w:pPr>
+              <w:pStyle w:val="Normal"/>
+              <w:widowControl/>
+              <w:spacing w:before="0" w:after="0"/>
+              <w:jc w:val="left"/>
+              <w:rPr>
+                <w:rFonts w:cs=""/>
+                <w:kern w:val="0"/>
+                <w:szCs w:val="22"/>
+                <w:lang w:val="en-US" w:eastAsia="en-US" w:bidi="ar-SA"/>
+              </w:rPr>
+            </w:pPr>
+            <w:r>
+              <w:rPr>
+                <w:rFonts w:cs=""/>
+                <w:b/>
+                <w:kern w:val="0"/>
+                <w:sz w:val="19"/>
+                <w:szCs w:val="22"/>
+                <w:lang w:val="en-US" w:eastAsia="en-US" w:bidi="ar-SA"/>
+              </w:rPr>
               <w:t>Hierarchy tree</w:t>
             </w:r>
           </w:p>
@@ -10514,7 +10694,7 @@
                 <w:szCs w:val="22"/>
                 <w:lang w:val="en-US" w:eastAsia="en-US" w:bidi="ar-SA"/>
               </w:rPr>
-              <w:t>File: New, Open, Open Recent, Save, Save As, Close, Export (Export XDTS, Export OCA), Preferences. Edit: Add Frame, Delete Frame (XSheet tab only), Add Layer, Find (Find Frame on the XSheet tab), Undo, Redo. XSheet: Sketchpad, Collapse Frames, Expand Frames, Export XSheet, Generate Report. XML: XML Editor (a check box), Validate (well-formed), Validate against Schema, Clear Validation, Select Schema, Clear Schema, Format. About: About, Reviews. Export opens its submenu like Open Recent.</w:t>
+              <w:t>File: New, Open, Open Recent, Save, Save As, Close, Export (Export XDTS, Export OCA), Preferences. Edit: Add Frame, Delete Frame (XSheet tab only), Add Layer, Delete Layer (XSheet tab only), Find (Find Frame on the XSheet tab), Undo, Redo. XSheet: Sketchpad, Collapse Frames, Expand Frames, Export XSheet, Generate Report. XML: XML Editor (a check box), Validate (well-formed), Validate against Schema, Clear Validation, Select Schema, Clear Schema, Format. About: About, Reviews. Export opens its submenu like Open Recent.</w:t>
             </w:r>
           </w:p>
         </w:tc>
@@ -13924,7 +14104,7 @@
       </w:pPr>
       <w:r>
         <w:rPr/>
-        <w:t>These were found during development and have not been filed as GitHub issues. The last four are new in this release.</w:t>
+        <w:t>These were found during development and have not been filed as GitHub issues. The last five are new in this release.</w:t>
       </w:r>
     </w:p>
     <w:tbl>
@@ -15819,6 +15999,72 @@
                 <w:lang w:val="en-US" w:eastAsia="en-US" w:bidi="ar-SA"/>
               </w:rPr>
               <w:t>While a string is being typed, scrolling the grid leaves the typing box where it was. Finish the string first.</w:t>
+            </w:r>
+          </w:p>
+        </w:tc>
+      </w:tr>
+      <w:tr>
+        <w:trPr>
+          <w:cantSplit w:val="true"/>
+        </w:trPr>
+        <w:tc>
+          <w:tcPr>
+            <w:tcW w:w="2304" w:type="dxa"/>
+            <w:tcBorders/>
+          </w:tcPr>
+          <w:p>
+            <w:pPr>
+              <w:pStyle w:val="Normal"/>
+              <w:widowControl/>
+              <w:spacing w:before="0" w:after="0"/>
+              <w:jc w:val="left"/>
+              <w:rPr>
+                <w:rFonts w:cs=""/>
+                <w:kern w:val="0"/>
+                <w:szCs w:val="22"/>
+                <w:lang w:val="en-US" w:eastAsia="en-US" w:bidi="ar-SA"/>
+              </w:rPr>
+            </w:pPr>
+            <w:r>
+              <w:rPr>
+                <w:rFonts w:cs=""/>
+                <w:b/>
+                <w:kern w:val="0"/>
+                <w:sz w:val="19"/>
+                <w:szCs w:val="22"/>
+                <w:lang w:val="en-US" w:eastAsia="en-US" w:bidi="ar-SA"/>
+              </w:rPr>
+              <w:t>Delete Layer on non-layer columns</w:t>
+            </w:r>
+          </w:p>
+        </w:tc>
+        <w:tc>
+          <w:tcPr>
+            <w:tcW w:w="7055" w:type="dxa"/>
+            <w:tcBorders/>
+          </w:tcPr>
+          <w:p>
+            <w:pPr>
+              <w:pStyle w:val="Normal"/>
+              <w:widowControl/>
+              <w:spacing w:before="0" w:after="0"/>
+              <w:jc w:val="left"/>
+              <w:rPr>
+                <w:rFonts w:cs=""/>
+                <w:kern w:val="0"/>
+                <w:szCs w:val="22"/>
+                <w:lang w:val="en-US" w:eastAsia="en-US" w:bidi="ar-SA"/>
+              </w:rPr>
+            </w:pPr>
+            <w:r>
+              <w:rPr>
+                <w:rFonts w:cs=""/>
+                <w:kern w:val="0"/>
+                <w:sz w:val="19"/>
+                <w:szCs w:val="22"/>
+                <w:lang w:val="en-US" w:eastAsia="en-US" w:bidi="ar-SA"/>
+              </w:rPr>
+              <w:t>Delete Layer removes a column’s data from every frame at once, and there is no way to delete from some frames only. Deleting Camera Moves leaves the camera keyframes, Tech. Notes leaves review comments, and deleting Notes leaves empty &lt;Notes/&gt; elements, as the schema requires them.</w:t>
             </w:r>
           </w:p>
         </w:tc>

</xml_diff>

<commit_message>
Sketchpad text: several lines (Shift+Enter adds a line, Enter ends)
The typing box is a text area that grows with its text. A multi-line string is
drawn a line each, saved as a <text> with a <tspan> per line, read back from
the SVG, and printed line by line by Export XSheet. README and the v1.4.0
Release Notes describe it.

Co-Authored-By: Claude Sonnet 5.5 <noreply@anthropic.com>
</commit_message>
<xml_diff>
--- a/doc/mlw-xsheet-v1.4.0-Release-Notes.docx
+++ b/doc/mlw-xsheet-v1.4.0-Release-Notes.docx
@@ -1837,7 +1837,7 @@
                 <w:szCs w:val="22"/>
                 <w:lang w:val="en-US" w:eastAsia="en-US" w:bidi="ar-SA"/>
               </w:rPr>
-              <w:t>A Text shape in the Shape chooser: click where the string goes, type it in the box that appears and press Enter (Escape drops it). Click a selected string to edit it; emptying it deletes it. The string takes the pen’s colour, and its type and size from Preferences &gt; Sketchpad.</w:t>
+              <w:t>A Text shape in the Shape chooser: click where the string goes, type it in the box that appears and press Enter (Shift+Enter starts a new line; Escape drops it). Click a selected string to edit it; emptying it deletes it. The string takes the pen’s colour, and its type and size from Preferences &gt; Sketchpad.</w:t>
             </w:r>
           </w:p>
         </w:tc>
@@ -1969,7 +1969,7 @@
                 <w:szCs w:val="22"/>
                 <w:lang w:val="en-US" w:eastAsia="en-US" w:bidi="ar-SA"/>
               </w:rPr>
-              <w:t>Strings are saved in the sketch’s .svg as &lt;text&gt; elements, with font-family and font-size, and printed by Export XSheet in Helvetica, Times or Courier to match.</w:t>
+              <w:t>Strings, which can have several lines, are saved in the sketch’s .svg as &lt;text&gt; elements (a &lt;tspan&gt; to each line), with font-family and font-size, and printed by Export XSheet in Helvetica, Times or Courier to match.</w:t>
             </w:r>
           </w:p>
         </w:tc>
@@ -2564,6 +2564,72 @@
                 <w:lang w:val="en-US" w:eastAsia="en-US" w:bidi="ar-SA"/>
               </w:rPr>
               <w:t>Below Add Frame, available on the XSheet tab only. A dialog asks for the starting frame (the selected one) and how many frames to delete; the rows are removed and the later frames move up.</w:t>
+            </w:r>
+          </w:p>
+        </w:tc>
+      </w:tr>
+      <w:tr>
+        <w:trPr>
+          <w:cantSplit w:val="true"/>
+        </w:trPr>
+        <w:tc>
+          <w:tcPr>
+            <w:tcW w:w="2880" w:type="dxa"/>
+            <w:tcBorders/>
+          </w:tcPr>
+          <w:p>
+            <w:pPr>
+              <w:pStyle w:val="Normal"/>
+              <w:widowControl/>
+              <w:spacing w:before="0" w:after="0"/>
+              <w:jc w:val="left"/>
+              <w:rPr>
+                <w:rFonts w:cs=""/>
+                <w:kern w:val="0"/>
+                <w:szCs w:val="22"/>
+                <w:lang w:val="en-US" w:eastAsia="en-US" w:bidi="ar-SA"/>
+              </w:rPr>
+            </w:pPr>
+            <w:r>
+              <w:rPr>
+                <w:rFonts w:cs=""/>
+                <w:b/>
+                <w:kern w:val="0"/>
+                <w:sz w:val="19"/>
+                <w:szCs w:val="22"/>
+                <w:lang w:val="en-US" w:eastAsia="en-US" w:bidi="ar-SA"/>
+              </w:rPr>
+              <w:t>Colour chooser highlight</w:t>
+            </w:r>
+          </w:p>
+        </w:tc>
+        <w:tc>
+          <w:tcPr>
+            <w:tcW w:w="6479" w:type="dxa"/>
+            <w:tcBorders/>
+          </w:tcPr>
+          <w:p>
+            <w:pPr>
+              <w:pStyle w:val="Normal"/>
+              <w:widowControl/>
+              <w:spacing w:before="0" w:after="0"/>
+              <w:jc w:val="left"/>
+              <w:rPr>
+                <w:rFonts w:cs=""/>
+                <w:kern w:val="0"/>
+                <w:szCs w:val="22"/>
+                <w:lang w:val="en-US" w:eastAsia="en-US" w:bidi="ar-SA"/>
+              </w:rPr>
+            </w:pPr>
+            <w:r>
+              <w:rPr>
+                <w:rFonts w:cs=""/>
+                <w:kern w:val="0"/>
+                <w:sz w:val="19"/>
+                <w:szCs w:val="22"/>
+                <w:lang w:val="en-US" w:eastAsia="en-US" w:bidi="ar-SA"/>
+              </w:rPr>
+              <w:t>The Sketchpad’s colour chooser rings the swatch you pick in the palette, and the pen’s colour when it opens; the ring goes when the chooser closes.</w:t>
             </w:r>
           </w:p>
         </w:tc>
@@ -7431,7 +7497,7 @@
                 <w:szCs w:val="22"/>
                 <w:lang w:val="en-US" w:eastAsia="en-US" w:bidi="ar-SA"/>
               </w:rPr>
-              <w:t>Text, in the Shape chooser: click where the string goes, type it in the box that appears, and press Enter or click away to place it (Escape drops it). With Select, click a string to select it, drag it to move it, and click it again to edit it; emptying it deletes it. A string takes the pen’s colour, which the colour chooser also changes on a selected string. Its type (Sans-serif, Serif or Monospace) and size (6–200 pixels) come from Preferences &gt; Sketchpad when it is typed and stay with it; the brush size does not affect it. Strings are saved in the .svg as &lt;text&gt; and printed by Export XSheet in Helvetica, Times or Courier.</w:t>
+              <w:t>Text, in the Shape chooser: click where the string goes, type it in the box that appears, and press Enter or click away to place it (Escape drops it). Shift+Enter starts a new line, so a string can have several lines. With Select, click a string to select it, drag it to move it, and click it again to edit it; emptying it deletes it. A string takes the pen’s colour, which the colour chooser also changes on a selected string. Its type (Sans-serif, Serif or Monospace) and size (6–200 pixels) come from Preferences &gt; Sketchpad when it is typed and stay with it; the brush size does not affect it. Strings are saved in the .svg as &lt;text&gt; (a &lt;tspan&gt; to each line) and printed by Export XSheet in Helvetica, Times or Courier.</w:t>
             </w:r>
           </w:p>
         </w:tc>
@@ -7599,7 +7665,33 @@
                 <w:szCs w:val="22"/>
                 <w:lang w:val="en-US" w:eastAsia="en-US" w:bidi="ar-SA"/>
               </w:rPr>
-              <w:t xml:space="preserve">Colour and brush</w:t>
+              <w:t>Colour and brush</w:t>
+            </w:r>
+          </w:p>
+          <w:p>
+            <w:pPr>
+              <w:pStyle w:val="Normal"/>
+              <w:widowControl/>
+              <w:spacing w:before="0" w:after="0"/>
+              <w:jc w:val="left"/>
+              <w:rPr>
+                <w:rFonts w:cs=""/>
+                <w:kern w:val="0"/>
+                <w:szCs w:val="22"/>
+                <w:lang w:val="en-US" w:eastAsia="en-US" w:bidi="ar-SA"/>
+              </w:rPr>
+            </w:pPr>
+            <w:r>
+              <w:rPr>
+                <w:rFonts w:cs=""/>
+                <w:b/>
+                <w:color w:val="B25E00"/>
+                <w:kern w:val="0"/>
+                <w:sz w:val="16"/>
+                <w:szCs w:val="22"/>
+                <w:lang w:val="en-US" w:eastAsia="en-US" w:bidi="ar-SA"/>
+              </w:rPr>
+              <w:t>Changed in 1.4.0</w:t>
             </w:r>
           </w:p>
         </w:tc>
@@ -7629,7 +7721,7 @@
                 <w:szCs w:val="22"/>
                 <w:lang w:val="en-US" w:eastAsia="en-US" w:bidi="ar-SA"/>
               </w:rPr>
-              <w:t xml:space="preserve">The colour button, a small square in the current colour, opens a colour chooser: a palette of 256 colours in small squares (16 rows of 16: a row of greys from white to black, then 15 hues round the colour wheel, a row each, in 16 shades from light to dark), and Spectrum and Tune views for any other colour. The brush button opens a brush chooser: a 1–24 px slider with a preview line, and quick sizes from 1 to 16 px. The pen starts at 4 px, in red. Both set the pen and restyle the selected shape, and apply a choice at once so you can see it; Cancel puts back what was there when the chooser opened, and Done keeps it, as a single Undo step.</w:t>
+              <w:t>The colour button, a small square in the current colour, opens a colour chooser: a palette of 256 colours in small squares (16 rows of 16: a row of greys from white to black, then 15 hues round the colour wheel, a row each, in 16 shades from light to dark), and Spectrum and Tune views for any other colour. The brush button opens a brush chooser: a 1–24 px slider with a preview line, and quick sizes from 1 to 16 px. The pen starts at 4 px, in red. Both set the pen and restyle the selected shape, and apply a choice at once so you can see it; Cancel puts back what was there when the chooser opened, and Done keeps it, as a single Undo step. In the palette, the swatch you pick is ringed, and so is the pen’s colour when the chooser opens (if it is in the grid); the ring goes when the chooser closes.</w:t>
             </w:r>
           </w:p>
         </w:tc>

</xml_diff>

<commit_message>
Find dialogs close when the tab changes away from what they search
Find & Replace closes on the XSheet tab; Find Frame closes on the XML and SVG
tabs. Opening one again closes the previous.

Co-Authored-By: Claude Sonnet 5.5 <noreply@anthropic.com>
</commit_message>
<xml_diff>
--- a/doc/mlw-xsheet-v1.4.0-Release-Notes.docx
+++ b/doc/mlw-xsheet-v1.4.0-Release-Notes.docx
@@ -4248,7 +4248,7 @@
                 <w:szCs w:val="22"/>
                 <w:lang w:val="en-US" w:eastAsia="en-US" w:bidi="ar-SA"/>
               </w:rPr>
-              <w:t>Case-sensitive and regular-expression search, with \1-style back-references in replacements. Find Next / Find Previous scroll to and highlight each match, and Replace / Replace All edit the document. The dialog sits at the right edge of the window, so it never covers the match, and the editor stays usable while it is open. It works on the editor of the tab showing: the XML editor, or on the SVG tab the SVG editor, where a replacement changes the sketch as typing there does. Switching tabs while it is open starts the search afresh in the other editor. On the XSheet tab, Find opens Find Frame instead (section 3.3).</w:t>
+              <w:t>Case-sensitive and regular-expression search, with \1-style back-references in replacements. Find Next / Find Previous scroll to and highlight each match, and Replace / Replace All edit the document. The dialog sits at the right edge of the window, so it never covers the match, and the editor stays usable while it is open. It works on the editor of the tab showing: the XML editor, or on the SVG tab the SVG editor, where a replacement changes the sketch as typing there does. Switching between the XML and SVG tabs while it is open starts the search afresh in the other editor, and going to the XSheet tab closes it. On the XSheet tab, Find opens Find Frame instead (section 3.3).</w:t>
             </w:r>
           </w:p>
         </w:tc>
@@ -6488,7 +6488,7 @@
                 <w:szCs w:val="22"/>
                 <w:lang w:val="en-US" w:eastAsia="en-US" w:bidi="ar-SA"/>
               </w:rPr>
-              <w:t>Edit &gt; Find on the XSheet tab opens a dialog at the right edge of the window. Type a frame number and press Enter or Go to scroll the grid to it and select it (a frame inside a collapsed run selects the run’s row; a number outside the sheet says so). Next Group and Previous Group step by frame group, as the shortcuts do, and show the frame reached. The grid stays usable while it is open.</w:t>
+              <w:t>Edit &gt; Find on the XSheet tab opens a dialog at the right edge of the window. Type a frame number and press Enter or Go to scroll the grid to it and select it (a frame inside a collapsed run selects the run’s row; a number outside the sheet says so). Next Group and Previous Group step by frame group, as the shortcuts do, and show the frame reached. The grid stays usable while it is open, and it closes when you go to the XML or SVG tab.</w:t>
             </w:r>
           </w:p>
         </w:tc>

</xml_diff>